<commit_message>
Plan belgesi guncellendi: Hafta 1 gorev dagilimi, SQL senkronizasyonu ve 9 haftalik plan
</commit_message>
<xml_diff>
--- a/Plan Belgesi - YemekBot.docx
+++ b/Plan Belgesi - YemekBot.docx
@@ -1093,7 +1093,7 @@
           <w:sz w:val="21"/>
           <w:szCs w:val="20"/>
         </w:rPr>
-        <w:t>AÜ Yemekhane Asistanı, Ankara Üniversitesi öğrencilerinin ve personelinin yemekhane menüsüne hızlı ve kolay biçimde ulaşmasını sağlayan, seçenek/buton tabanlı sohbet botu destekli bir web portalıdır. Üniversitenin her ay yayımladığı öğle ve akşam yemeği Excel dosyaları yönetici panelinden doğrudan yüklenir; sistem tarihleri, yemekleri, kalori değerlerini ve tatil günlerini otomatik olarak ayrıştırır, hatalı satırları yöneticiye raporlar. Sohbet ekranı açıldığında varsayılan olarak bugünün öğle menüsü gösterilir; kullanıcı metin yazmak zorunda kalmadan “Puanlama”, “Akşam Yemeği”, “Ertesi Günün Öğle Yemeği” (ve sonraki günlerde aktifleşen “Önceki Günün Öğle Yemeği”) ile “Yardım / İletişim” butonlarını kullanarak menüler arasında hızlıca gezinebilir.</w:t>
+        <w:t>AÜ Yemekhane Asistanı, Ankara Üniversitesi öğrencilerinin ve personelinin yemekhane menüsüne hızlı ve kolay biçimde ulaşmasını sağlayan, seçenek/buton tabanlı sohbet botu destekli bir web portalıdır. Üniversitenin her ay yayımladığı öğle ve akşam yemeği Excel dosyaları yönetici panelinden doğrudan yüklenir; sistem tarihleri, yemekleri, kalori değerlerini ve tatil günlerini otomatik olarak ayrıştırır, hatalı satırları yöneticiye raporlar. Sohbet ekranı açıldığında varsayılan olarak bugünün öğle menüsü gösterilir; kullanıcı metin yazmak zorunda kalmadan “Puanlama”, “Akşam Yemeği”, “Ertesi Günün Öğle Yemeği” (ve sonraki günlerde aktifleşen “Önceki Günün Öğle Yemeği”) ile “Yardım” butonlarını kullanarak menüler arasında hızlıca gezinebilir.</w:t>
       </w:r>
     </w:p>
     <w:p>
@@ -1127,7 +1127,7 @@
           <w:sz w:val="21"/>
           <w:szCs w:val="20"/>
         </w:rPr>
-        <w:t>Temel işlevler: (1) günlük/aylık menü ve kalori görüntüleme, (2) seçenek/buton yönlendirmeli etkileşimli sohbet botu (varsayılan bugün öğle, akşam geçişi, ileri/geri gün geçişleri, puanlama ve yardım/e-posta desteği), (3) yemek puanlama ve yorum, (4) kullanıcı kaydı/girişi ve rol tabanlı yetkilendirme (Yönetici, Öğrenci), (5) yönetici paneli üzerinden yemek, menü ve yorum yönetimi ile aylık Excel listelerinin içe aktarılması, (6) aynı seçenek/buton yapısıyla çalışan Telegram botu, (7) Swagger ile belgelenmiş ve Flutter iOS uygulamasının da veri kaynağı olacak Web API.</w:t>
+        <w:t>Temel işlevler: (1) günlük/aylık menü ve kalori görüntüleme, (2) seçenek/buton yönlendirmeli etkileşimli sohbet botu (varsayılan bugün öğle, akşam geçişi, ileri/geri gün geçişleri, puanlama ve yardım/e-posta desteği), (3) yemek puanlama ve yorum, (4) kullanıcı kaydı/girişi ve rol tabanlı yetkilendirme (Yönetici, Öğrenci), (5) yönetici paneli üzerinden yemek, menü ve yorum yönetimi ile aylık Excel listelerinin içe aktarılması, (6) aynı seçenek/buton yapısıyla çalışan Telegram botu, (7) menü ve puan verilerini dış uygulamalara açan, Swagger ile belgelenmiş bir Web API. Geliştirilecek bu Web API aynı zamanda grubun mobil uygulama geliştirme dersi kapsamında Flutter ile hazırlayacağı iOS uygulamasına da entegre edilerek ortak veri kaynağı olarak kullanılacaktır.</w:t>
       </w:r>
     </w:p>
     <w:p>
@@ -1452,7 +1452,7 @@
                 <w:sz w:val="21"/>
                 <w:szCs w:val="21"/>
               </w:rPr>
-              <w:t>Menü (Menu) – /api/menuler için tam CRUD (GET, POST, PUT, DELETE). Ek olarak /api/yemekler, /api/degerlendirmeler ve /api/bot/adim (seçenek tabanlı bot durum/geçiş uç noktası). Tüm uç noktalar Swagger üzerinden test edilecektir.</w:t>
+              <w:t>Menü (Menu) – /api/menuler için tam CRUD (GET, POST, PUT, DELETE). Ek olarak /api/yemekler, /api/degerlendirmeler ve /api/bot/adim (seçenek tabanlı bot geçiş uç noktası). Tüm uç noktalar Swagger üzerinden test edilecektir.</w:t>
             </w:r>
           </w:p>
         </w:tc>
@@ -1524,7 +1524,7 @@
                 <w:sz w:val="21"/>
                 <w:szCs w:val="21"/>
               </w:rPr>
-              <w:t>Telegram Bot API (Telegram.Bot kütüphanesi) – Inline Keyboard (satır içi butonlar) ile Bugün Öğle, Akşam, Ertesi/Önceki Gün, Puanlama ve Yardım (e-posta iletişim) seçeneklerini sunan etkileşimli bot.</w:t>
+              <w:t>Telegram Bot API (Telegram.Bot kütüphanesi) – Inline Keyboard (satır içi butonlar) ile Bugün Öğle, Akşam, Ertesi/Önceki Gün Öğle, Puanlama ve Yardım (e-posta iletişim) seçeneklerini sunan etkileşimli bot.</w:t>
             </w:r>
           </w:p>
         </w:tc>
@@ -1668,7 +1668,7 @@
                 <w:sz w:val="21"/>
                 <w:szCs w:val="21"/>
               </w:rPr>
-              <w:t>ASP.NET Core 10, Entity Framework Core (Code-First, migration), ASP.NET Core Identity, Bootstrap 5 tabanlı hazır yönetici şablonu (AdminLTE / SB Admin 2), Swashbuckle (Swagger UI), ClosedXML (üniversitenin Excel menü dosyalarını okuma), Chart.js (istatistik grafikleri), JWT (mobil istemci kimlik doğrulaması).</w:t>
+              <w:t>ASP.NET Core, Entity Framework Core (Code-First, migration), ASP.NET Core Identity, Bootstrap 5 tabanlı hazır yönetici şablonu (SB Admin / AdminLTE), Swashbuckle (Swagger UI), ClosedXML (Excel menü okuma), Chart.js (istatistik grafikleri).</w:t>
             </w:r>
           </w:p>
         </w:tc>
@@ -3261,55 +3261,39 @@
                 <w:sz w:val="21"/>
                 <w:szCs w:val="21"/>
               </w:rPr>
-              <w:t>1) Public GitHub deposu, .gitignore, README taslağı, Drive klasörü</w:t>
-            </w:r>
-          </w:p>
-          <w:p>
-            <w:pPr>
-              <w:spacing w:after="0"/>
-              <w:jc w:val="left"/>
-            </w:pPr>
-            <w:r>
-              <w:rPr>
-                <w:rFonts w:ascii="Calibri" w:cs="Calibri" w:eastAsia="Calibri" w:hAnsi="Calibri"/>
-                <w:b w:val="false"/>
-                <w:bCs w:val="false"/>
-                <w:sz w:val="21"/>
-                <w:szCs w:val="21"/>
-              </w:rPr>
-              <w:t>2) ASP.NET Core Razor Pages proje iskeleti ve klasör yapısı</w:t>
-            </w:r>
-          </w:p>
-          <w:p>
-            <w:pPr>
-              <w:spacing w:after="0"/>
-              <w:jc w:val="left"/>
-            </w:pPr>
-            <w:r>
-              <w:rPr>
-                <w:rFonts w:ascii="Calibri" w:cs="Calibri" w:eastAsia="Calibri" w:hAnsi="Calibri"/>
-                <w:b w:val="false"/>
-                <w:bCs w:val="false"/>
-                <w:sz w:val="21"/>
-                <w:szCs w:val="21"/>
-              </w:rPr>
-              <w:t>3) Bootstrap tasarım şablonu, _Layout, navigasyon, mobil uyum</w:t>
-            </w:r>
-          </w:p>
-          <w:p>
-            <w:pPr>
-              <w:spacing w:after="0"/>
-              <w:jc w:val="left"/>
-            </w:pPr>
-            <w:r>
-              <w:rPr>
-                <w:rFonts w:ascii="Calibri" w:cs="Calibri" w:eastAsia="Calibri" w:hAnsi="Calibri"/>
-                <w:b w:val="false"/>
-                <w:bCs w:val="false"/>
-                <w:sz w:val="21"/>
-                <w:szCs w:val="21"/>
-              </w:rPr>
-              <w:t>4) Üniversitenin Ekim 2026 öğle/akşam Excel dosyalarının incelenmesi; model sınıfları taslağı</w:t>
+              <w:t>1) Public GitHub deposu, .gitignore, README taslağı ve Google Drive klasörünün açılması</w:t>
+            </w:r>
+          </w:p>
+          <w:p>
+            <w:pPr>
+              <w:spacing w:after="0"/>
+              <w:jc w:val="left"/>
+            </w:pPr>
+            <w:r>
+              <w:rPr>
+                <w:rFonts w:ascii="Calibri" w:cs="Calibri" w:eastAsia="Calibri" w:hAnsi="Calibri"/>
+                <w:b w:val="false"/>
+                <w:bCs w:val="false"/>
+                <w:sz w:val="21"/>
+                <w:szCs w:val="21"/>
+              </w:rPr>
+              <w:t>2) ASP.NET Core Razor Pages proje iskeleti, Bootstrap 5 şablonu, _Layout ve mobil uyumlu navigasyon</w:t>
+            </w:r>
+          </w:p>
+          <w:p>
+            <w:pPr>
+              <w:spacing w:after="0"/>
+              <w:jc w:val="left"/>
+            </w:pPr>
+            <w:r>
+              <w:rPr>
+                <w:rFonts w:ascii="Calibri" w:cs="Calibri" w:eastAsia="Calibri" w:hAnsi="Calibri"/>
+                <w:b w:val="false"/>
+                <w:bCs w:val="false"/>
+                <w:sz w:val="21"/>
+                <w:szCs w:val="21"/>
+              </w:rPr>
+              <w:t>3) Üniversitenin Ekim 2026 öğle/akşam Excel menü dosyalarının incelenmesi ve temel model sınıfları taslağı</w:t>
             </w:r>
           </w:p>
         </w:tc>
@@ -3342,39 +3326,39 @@
                 <w:sz w:val="21"/>
                 <w:szCs w:val="21"/>
               </w:rPr>
-              <w:t>Yılmaz Emre Gündaş: 1, 2</w:t>
-            </w:r>
-          </w:p>
-          <w:p>
-            <w:pPr>
-              <w:spacing w:after="0"/>
-              <w:jc w:val="left"/>
-            </w:pPr>
-            <w:r>
-              <w:rPr>
-                <w:rFonts w:ascii="Calibri" w:cs="Calibri" w:eastAsia="Calibri" w:hAnsi="Calibri"/>
-                <w:b w:val="false"/>
-                <w:bCs w:val="false"/>
-                <w:sz w:val="21"/>
-                <w:szCs w:val="21"/>
-              </w:rPr>
-              <w:t>Arife Ebrar Üstüner: 3</w:t>
-            </w:r>
-          </w:p>
-          <w:p>
-            <w:pPr>
-              <w:spacing w:after="0"/>
-              <w:jc w:val="left"/>
-            </w:pPr>
-            <w:r>
-              <w:rPr>
-                <w:rFonts w:ascii="Calibri" w:cs="Calibri" w:eastAsia="Calibri" w:hAnsi="Calibri"/>
-                <w:b w:val="false"/>
-                <w:bCs w:val="false"/>
-                <w:sz w:val="21"/>
-                <w:szCs w:val="21"/>
-              </w:rPr>
-              <w:t>Efe Can Seymen: 4</w:t>
+              <w:t>Arife Ebrar Üstüner: 1</w:t>
+            </w:r>
+          </w:p>
+          <w:p>
+            <w:pPr>
+              <w:spacing w:after="0"/>
+              <w:jc w:val="left"/>
+            </w:pPr>
+            <w:r>
+              <w:rPr>
+                <w:rFonts w:ascii="Calibri" w:cs="Calibri" w:eastAsia="Calibri" w:hAnsi="Calibri"/>
+                <w:b w:val="false"/>
+                <w:bCs w:val="false"/>
+                <w:sz w:val="21"/>
+                <w:szCs w:val="21"/>
+              </w:rPr>
+              <w:t>Yılmaz Emre Gündaş: 2</w:t>
+            </w:r>
+          </w:p>
+          <w:p>
+            <w:pPr>
+              <w:spacing w:after="0"/>
+              <w:jc w:val="left"/>
+            </w:pPr>
+            <w:r>
+              <w:rPr>
+                <w:rFonts w:ascii="Calibri" w:cs="Calibri" w:eastAsia="Calibri" w:hAnsi="Calibri"/>
+                <w:b w:val="false"/>
+                <w:bCs w:val="false"/>
+                <w:sz w:val="21"/>
+                <w:szCs w:val="21"/>
+              </w:rPr>
+              <w:t>Efe Can Seymen: 3</w:t>
             </w:r>
           </w:p>
         </w:tc>
@@ -3480,55 +3464,55 @@
                 <w:sz w:val="21"/>
                 <w:szCs w:val="21"/>
               </w:rPr>
-              <w:t>1) EF Core + SQL Server kurulumu, DbContext, ilk migration</w:t>
-            </w:r>
-          </w:p>
-          <w:p>
-            <w:pPr>
-              <w:spacing w:after="0"/>
-              <w:jc w:val="left"/>
-            </w:pPr>
-            <w:r>
-              <w:rPr>
-                <w:rFonts w:ascii="Calibri" w:cs="Calibri" w:eastAsia="Calibri" w:hAnsi="Calibri"/>
-                <w:b w:val="false"/>
-                <w:bCs w:val="false"/>
-                <w:sz w:val="21"/>
-                <w:szCs w:val="21"/>
-              </w:rPr>
-              <w:t>2) Kategori–Yemek bire-çok ilişkisi, kategori seed verisi</w:t>
-            </w:r>
-          </w:p>
-          <w:p>
-            <w:pPr>
-              <w:spacing w:after="0"/>
-              <w:jc w:val="left"/>
-            </w:pPr>
-            <w:r>
-              <w:rPr>
-                <w:rFonts w:ascii="Calibri" w:cs="Calibri" w:eastAsia="Calibri" w:hAnsi="Calibri"/>
-                <w:b w:val="false"/>
-                <w:bCs w:val="false"/>
-                <w:sz w:val="21"/>
-                <w:szCs w:val="21"/>
-              </w:rPr>
-              <w:t>3) Yemek ve Kategori CRUD sayfaları, form doğrulama</w:t>
-            </w:r>
-          </w:p>
-          <w:p>
-            <w:pPr>
-              <w:spacing w:after="0"/>
-              <w:jc w:val="left"/>
-            </w:pPr>
-            <w:r>
-              <w:rPr>
-                <w:rFonts w:ascii="Calibri" w:cs="Calibri" w:eastAsia="Calibri" w:hAnsi="Calibri"/>
-                <w:b w:val="false"/>
-                <w:bCs w:val="false"/>
-                <w:sz w:val="21"/>
-                <w:szCs w:val="21"/>
-              </w:rPr>
-              <w:t>4) ClosedXML ile Excel okuma prototipi (tarih, yemek adı ve kalori ayrıştırma)</w:t>
+              <w:t>1) EF Core kurulumu, YemekBotDbContext, Kategori–Yemek (1–N) ve Menü–Yemek (N–N) ilişkileri, ilk migration</w:t>
+            </w:r>
+          </w:p>
+          <w:p>
+            <w:pPr>
+              <w:spacing w:after="0"/>
+              <w:jc w:val="left"/>
+            </w:pPr>
+            <w:r>
+              <w:rPr>
+                <w:rFonts w:ascii="Calibri" w:cs="Calibri" w:eastAsia="Calibri" w:hAnsi="Calibri"/>
+                <w:b w:val="false"/>
+                <w:bCs w:val="false"/>
+                <w:sz w:val="21"/>
+                <w:szCs w:val="21"/>
+              </w:rPr>
+              <w:t>2) Kategori ve başlangıç (seed) verilerinin oluşturulması</w:t>
+            </w:r>
+          </w:p>
+          <w:p>
+            <w:pPr>
+              <w:spacing w:after="0"/>
+              <w:jc w:val="left"/>
+            </w:pPr>
+            <w:r>
+              <w:rPr>
+                <w:rFonts w:ascii="Calibri" w:cs="Calibri" w:eastAsia="Calibri" w:hAnsi="Calibri"/>
+                <w:b w:val="false"/>
+                <w:bCs w:val="false"/>
+                <w:sz w:val="21"/>
+                <w:szCs w:val="21"/>
+              </w:rPr>
+              <w:t>3) Yemek ve Kategori CRUD sayfaları ile form doğrulama (Data Annotations validation) kuralları</w:t>
+            </w:r>
+          </w:p>
+          <w:p>
+            <w:pPr>
+              <w:spacing w:after="0"/>
+              <w:jc w:val="left"/>
+            </w:pPr>
+            <w:r>
+              <w:rPr>
+                <w:rFonts w:ascii="Calibri" w:cs="Calibri" w:eastAsia="Calibri" w:hAnsi="Calibri"/>
+                <w:b w:val="false"/>
+                <w:bCs w:val="false"/>
+                <w:sz w:val="21"/>
+                <w:szCs w:val="21"/>
+              </w:rPr>
+              <w:t>4) Tüm ekip bilgisayarlarında SQL Server LocalDB kurulumu ve dotnet ef database update ile senkronizasyon</w:t>
             </w:r>
           </w:p>
         </w:tc>
@@ -3561,7 +3545,23 @@
                 <w:sz w:val="21"/>
                 <w:szCs w:val="21"/>
               </w:rPr>
-              <w:t>Yılmaz Emre Gündaş: 1, 2</w:t>
+              <w:t>Yılmaz Emre Gündaş: 1</w:t>
+            </w:r>
+          </w:p>
+          <w:p>
+            <w:pPr>
+              <w:spacing w:after="0"/>
+              <w:jc w:val="left"/>
+            </w:pPr>
+            <w:r>
+              <w:rPr>
+                <w:rFonts w:ascii="Calibri" w:cs="Calibri" w:eastAsia="Calibri" w:hAnsi="Calibri"/>
+                <w:b w:val="false"/>
+                <w:bCs w:val="false"/>
+                <w:sz w:val="21"/>
+                <w:szCs w:val="21"/>
+              </w:rPr>
+              <w:t>Efe Can Seymen: 2</w:t>
             </w:r>
           </w:p>
           <w:p>
@@ -3593,7 +3593,7 @@
                 <w:sz w:val="21"/>
                 <w:szCs w:val="21"/>
               </w:rPr>
-              <w:t>Efe Can Seymen: 4</w:t>
+              <w:t>Tüm üyeler: 4</w:t>
             </w:r>
           </w:p>
         </w:tc>
@@ -3699,55 +3699,39 @@
                 <w:sz w:val="21"/>
                 <w:szCs w:val="21"/>
               </w:rPr>
-              <w:t>1) Menuler ve MenuYemekleri (çoka-çok) tabloları, migration</w:t>
-            </w:r>
-          </w:p>
-          <w:p>
-            <w:pPr>
-              <w:spacing w:after="0"/>
-              <w:jc w:val="left"/>
-            </w:pPr>
-            <w:r>
-              <w:rPr>
-                <w:rFonts w:ascii="Calibri" w:cs="Calibri" w:eastAsia="Calibri" w:hAnsi="Calibri"/>
-                <w:b w:val="false"/>
-                <w:bCs w:val="false"/>
-                <w:sz w:val="21"/>
-                <w:szCs w:val="21"/>
-              </w:rPr>
-              <w:t>2) Menü oluşturma/düzenleme sayfaları (yemek seçimi ile)</w:t>
-            </w:r>
-          </w:p>
-          <w:p>
-            <w:pPr>
-              <w:spacing w:after="0"/>
-              <w:jc w:val="left"/>
-            </w:pPr>
-            <w:r>
-              <w:rPr>
-                <w:rFonts w:ascii="Calibri" w:cs="Calibri" w:eastAsia="Calibri" w:hAnsi="Calibri"/>
-                <w:b w:val="false"/>
-                <w:bCs w:val="false"/>
-                <w:sz w:val="21"/>
-                <w:szCs w:val="21"/>
-              </w:rPr>
-              <w:t>3) Ana sayfada “Bugünün Menüsü” (öğle/akşam, kalori) ve aylık takvim görünümü</w:t>
-            </w:r>
-          </w:p>
-          <w:p>
-            <w:pPr>
-              <w:spacing w:after="0"/>
-              <w:jc w:val="left"/>
-            </w:pPr>
-            <w:r>
-              <w:rPr>
-                <w:rFonts w:ascii="Calibri" w:cs="Calibri" w:eastAsia="Calibri" w:hAnsi="Calibri"/>
-                <w:b w:val="false"/>
-                <w:bCs w:val="false"/>
-                <w:sz w:val="21"/>
-                <w:szCs w:val="21"/>
-              </w:rPr>
-              <w:t>4) Tarih ve öğüne göre arama/filtreleme</w:t>
+              <w:t>1) Menü oluşturma/düzenleme sayfaları (yemek seçimi ve toplam kalori hesaplama)</w:t>
+            </w:r>
+          </w:p>
+          <w:p>
+            <w:pPr>
+              <w:spacing w:after="0"/>
+              <w:jc w:val="left"/>
+            </w:pPr>
+            <w:r>
+              <w:rPr>
+                <w:rFonts w:ascii="Calibri" w:cs="Calibri" w:eastAsia="Calibri" w:hAnsi="Calibri"/>
+                <w:b w:val="false"/>
+                <w:bCs w:val="false"/>
+                <w:sz w:val="21"/>
+                <w:szCs w:val="21"/>
+              </w:rPr>
+              <w:t>2) Ana sayfada “Bugünün Menüsü” (Öğle/Akşam sekmeli) ve aylık yemek takvimi görünümü</w:t>
+            </w:r>
+          </w:p>
+          <w:p>
+            <w:pPr>
+              <w:spacing w:after="0"/>
+              <w:jc w:val="left"/>
+            </w:pPr>
+            <w:r>
+              <w:rPr>
+                <w:rFonts w:ascii="Calibri" w:cs="Calibri" w:eastAsia="Calibri" w:hAnsi="Calibri"/>
+                <w:b w:val="false"/>
+                <w:bCs w:val="false"/>
+                <w:sz w:val="21"/>
+                <w:szCs w:val="21"/>
+              </w:rPr>
+              <w:t>3) ClosedXML ile üniversitenin Excel menü dosyalarını okuma ve yemek/kalori/tatil ayrıştırma servisi</w:t>
             </w:r>
           </w:p>
         </w:tc>
@@ -3796,23 +3780,23 @@
                 <w:sz w:val="21"/>
                 <w:szCs w:val="21"/>
               </w:rPr>
-              <w:t>Arife Ebrar Üstüner: 3</w:t>
-            </w:r>
-          </w:p>
-          <w:p>
-            <w:pPr>
-              <w:spacing w:after="0"/>
-              <w:jc w:val="left"/>
-            </w:pPr>
-            <w:r>
-              <w:rPr>
-                <w:rFonts w:ascii="Calibri" w:cs="Calibri" w:eastAsia="Calibri" w:hAnsi="Calibri"/>
-                <w:b w:val="false"/>
-                <w:bCs w:val="false"/>
-                <w:sz w:val="21"/>
-                <w:szCs w:val="21"/>
-              </w:rPr>
-              <w:t>Efe Can Seymen: 2, 4</w:t>
+              <w:t>Arife Ebrar Üstüner: 2</w:t>
+            </w:r>
+          </w:p>
+          <w:p>
+            <w:pPr>
+              <w:spacing w:after="0"/>
+              <w:jc w:val="left"/>
+            </w:pPr>
+            <w:r>
+              <w:rPr>
+                <w:rFonts w:ascii="Calibri" w:cs="Calibri" w:eastAsia="Calibri" w:hAnsi="Calibri"/>
+                <w:b w:val="false"/>
+                <w:bCs w:val="false"/>
+                <w:sz w:val="21"/>
+                <w:szCs w:val="21"/>
+              </w:rPr>
+              <w:t>Efe Can Seymen: 3</w:t>
             </w:r>
           </w:p>
         </w:tc>
@@ -3918,71 +3902,55 @@
                 <w:sz w:val="21"/>
                 <w:szCs w:val="21"/>
               </w:rPr>
-              <w:t>1) ASP.NET Core Identity ile kayıt/giriş</w:t>
-            </w:r>
-          </w:p>
-          <w:p>
-            <w:pPr>
-              <w:spacing w:after="0"/>
-              <w:jc w:val="left"/>
-            </w:pPr>
-            <w:r>
-              <w:rPr>
-                <w:rFonts w:ascii="Calibri" w:cs="Calibri" w:eastAsia="Calibri" w:hAnsi="Calibri"/>
-                <w:b w:val="false"/>
-                <w:bCs w:val="false"/>
-                <w:sz w:val="21"/>
-                <w:szCs w:val="21"/>
-              </w:rPr>
-              <w:t>2) Yönetici ve Öğrenci rolleri, sayfa yetkilendirmesi</w:t>
-            </w:r>
-          </w:p>
-          <w:p>
-            <w:pPr>
-              <w:spacing w:after="0"/>
-              <w:jc w:val="left"/>
-            </w:pPr>
-            <w:r>
-              <w:rPr>
-                <w:rFonts w:ascii="Calibri" w:cs="Calibri" w:eastAsia="Calibri" w:hAnsi="Calibri"/>
-                <w:b w:val="false"/>
-                <w:bCs w:val="false"/>
-                <w:sz w:val="21"/>
-                <w:szCs w:val="21"/>
-              </w:rPr>
-              <w:t>3) Yönetici paneli iskeleti</w:t>
-            </w:r>
-          </w:p>
-          <w:p>
-            <w:pPr>
-              <w:spacing w:after="0"/>
-              <w:jc w:val="left"/>
-            </w:pPr>
-            <w:r>
-              <w:rPr>
-                <w:rFonts w:ascii="Calibri" w:cs="Calibri" w:eastAsia="Calibri" w:hAnsi="Calibri"/>
-                <w:b w:val="false"/>
-                <w:bCs w:val="false"/>
-                <w:sz w:val="21"/>
-                <w:szCs w:val="21"/>
-              </w:rPr>
-              <w:t>4) Excel içe aktarma ekranı: önizleme, tatil günleri, hatalı tarih uyarıları, MenuYuklemeleri kaydı</w:t>
-            </w:r>
-          </w:p>
-          <w:p>
-            <w:pPr>
-              <w:spacing w:after="0"/>
-              <w:jc w:val="left"/>
-            </w:pPr>
-            <w:r>
-              <w:rPr>
-                <w:rFonts w:ascii="Calibri" w:cs="Calibri" w:eastAsia="Calibri" w:hAnsi="Calibri"/>
-                <w:b w:val="false"/>
-                <w:bCs w:val="false"/>
-                <w:sz w:val="21"/>
-                <w:szCs w:val="21"/>
-              </w:rPr>
-              <w:t>5) 1. sınıf içi gösterim (18 Kasım) hazırlığı</w:t>
+              <w:t>1) ASP.NET Core Identity ile kullanıcı kayıt/giriş işlemleri ve Yönetici/Öğrenci rollerinin tanımlanması</w:t>
+            </w:r>
+          </w:p>
+          <w:p>
+            <w:pPr>
+              <w:spacing w:after="0"/>
+              <w:jc w:val="left"/>
+            </w:pPr>
+            <w:r>
+              <w:rPr>
+                <w:rFonts w:ascii="Calibri" w:cs="Calibri" w:eastAsia="Calibri" w:hAnsi="Calibri"/>
+                <w:b w:val="false"/>
+                <w:bCs w:val="false"/>
+                <w:sz w:val="21"/>
+                <w:szCs w:val="21"/>
+              </w:rPr>
+              <w:t>2) Yönetici paneli arayüzü ve sayfa yetkilendirme kuralları</w:t>
+            </w:r>
+          </w:p>
+          <w:p>
+            <w:pPr>
+              <w:spacing w:after="0"/>
+              <w:jc w:val="left"/>
+            </w:pPr>
+            <w:r>
+              <w:rPr>
+                <w:rFonts w:ascii="Calibri" w:cs="Calibri" w:eastAsia="Calibri" w:hAnsi="Calibri"/>
+                <w:b w:val="false"/>
+                <w:bCs w:val="false"/>
+                <w:sz w:val="21"/>
+                <w:szCs w:val="21"/>
+              </w:rPr>
+              <w:t>3) Yönetici panelinden aylık Excel menü yükleme ekranı (hatalı tarih uyarısı ve MenuYuklemeleri kaydı)</w:t>
+            </w:r>
+          </w:p>
+          <w:p>
+            <w:pPr>
+              <w:spacing w:after="0"/>
+              <w:jc w:val="left"/>
+            </w:pPr>
+            <w:r>
+              <w:rPr>
+                <w:rFonts w:ascii="Calibri" w:cs="Calibri" w:eastAsia="Calibri" w:hAnsi="Calibri"/>
+                <w:b w:val="false"/>
+                <w:bCs w:val="false"/>
+                <w:sz w:val="21"/>
+                <w:szCs w:val="21"/>
+              </w:rPr>
+              <w:t>4) 1. sınıf içi gösterim (18 Kasım) hazırlığı ve örnek verilerin kontrolü</w:t>
             </w:r>
           </w:p>
         </w:tc>
@@ -4015,39 +3983,39 @@
                 <w:sz w:val="21"/>
                 <w:szCs w:val="21"/>
               </w:rPr>
-              <w:t>Yılmaz Emre Gündaş: 1, 2</w:t>
-            </w:r>
-          </w:p>
-          <w:p>
-            <w:pPr>
-              <w:spacing w:after="0"/>
-              <w:jc w:val="left"/>
-            </w:pPr>
-            <w:r>
-              <w:rPr>
-                <w:rFonts w:ascii="Calibri" w:cs="Calibri" w:eastAsia="Calibri" w:hAnsi="Calibri"/>
-                <w:b w:val="false"/>
-                <w:bCs w:val="false"/>
-                <w:sz w:val="21"/>
-                <w:szCs w:val="21"/>
-              </w:rPr>
-              <w:t>Arife Ebrar Üstüner: 3, 5</w:t>
-            </w:r>
-          </w:p>
-          <w:p>
-            <w:pPr>
-              <w:spacing w:after="0"/>
-              <w:jc w:val="left"/>
-            </w:pPr>
-            <w:r>
-              <w:rPr>
-                <w:rFonts w:ascii="Calibri" w:cs="Calibri" w:eastAsia="Calibri" w:hAnsi="Calibri"/>
-                <w:b w:val="false"/>
-                <w:bCs w:val="false"/>
-                <w:sz w:val="21"/>
-                <w:szCs w:val="21"/>
-              </w:rPr>
-              <w:t>Efe Can Seymen: 4</w:t>
+              <w:t>Yılmaz Emre Gündaş: 1</w:t>
+            </w:r>
+          </w:p>
+          <w:p>
+            <w:pPr>
+              <w:spacing w:after="0"/>
+              <w:jc w:val="left"/>
+            </w:pPr>
+            <w:r>
+              <w:rPr>
+                <w:rFonts w:ascii="Calibri" w:cs="Calibri" w:eastAsia="Calibri" w:hAnsi="Calibri"/>
+                <w:b w:val="false"/>
+                <w:bCs w:val="false"/>
+                <w:sz w:val="21"/>
+                <w:szCs w:val="21"/>
+              </w:rPr>
+              <w:t>Arife Ebrar Üstüner: 2, 4</w:t>
+            </w:r>
+          </w:p>
+          <w:p>
+            <w:pPr>
+              <w:spacing w:after="0"/>
+              <w:jc w:val="left"/>
+            </w:pPr>
+            <w:r>
+              <w:rPr>
+                <w:rFonts w:ascii="Calibri" w:cs="Calibri" w:eastAsia="Calibri" w:hAnsi="Calibri"/>
+                <w:b w:val="false"/>
+                <w:bCs w:val="false"/>
+                <w:sz w:val="21"/>
+                <w:szCs w:val="21"/>
+              </w:rPr>
+              <w:t>Efe Can Seymen: 3</w:t>
             </w:r>
           </w:p>
         </w:tc>
@@ -4153,55 +4121,55 @@
                 <w:sz w:val="21"/>
                 <w:szCs w:val="21"/>
               </w:rPr>
-              <w:t>1) Degerlendirmeler tablosu, puan (1–5) ve yorum formu, doğrulama</w:t>
-            </w:r>
-          </w:p>
-          <w:p>
-            <w:pPr>
-              <w:spacing w:after="0"/>
-              <w:jc w:val="left"/>
-            </w:pPr>
-            <w:r>
-              <w:rPr>
-                <w:rFonts w:ascii="Calibri" w:cs="Calibri" w:eastAsia="Calibri" w:hAnsi="Calibri"/>
-                <w:b w:val="false"/>
-                <w:bCs w:val="false"/>
-                <w:sz w:val="21"/>
-                <w:szCs w:val="21"/>
-              </w:rPr>
-              <w:t>2) Ortalama puanlar, en beğenilen / en az beğenilen yemekler sayfası</w:t>
-            </w:r>
-          </w:p>
-          <w:p>
-            <w:pPr>
-              <w:spacing w:after="0"/>
-              <w:jc w:val="left"/>
-            </w:pPr>
-            <w:r>
-              <w:rPr>
-                <w:rFonts w:ascii="Calibri" w:cs="Calibri" w:eastAsia="Calibri" w:hAnsi="Calibri"/>
-                <w:b w:val="false"/>
-                <w:bCs w:val="false"/>
-                <w:sz w:val="21"/>
-                <w:szCs w:val="21"/>
-              </w:rPr>
-              <w:t>3) Yönetici panelinde yorum moderasyonu</w:t>
-            </w:r>
-          </w:p>
-          <w:p>
-            <w:pPr>
-              <w:spacing w:after="0"/>
-              <w:jc w:val="left"/>
-            </w:pPr>
-            <w:r>
-              <w:rPr>
-                <w:rFonts w:ascii="Calibri" w:cs="Calibri" w:eastAsia="Calibri" w:hAnsi="Calibri"/>
-                <w:b w:val="false"/>
-                <w:bCs w:val="false"/>
-                <w:sz w:val="21"/>
-                <w:szCs w:val="21"/>
-              </w:rPr>
-              <w:t>4) 1. gösterim geri bildirimlerinin düzeltilmesi</w:t>
+              <w:t>1) Degerlendirmeler tablosu, yemeklere 1–5 arası puan verme ve yorum ekleme formları</w:t>
+            </w:r>
+          </w:p>
+          <w:p>
+            <w:pPr>
+              <w:spacing w:after="0"/>
+              <w:jc w:val="left"/>
+            </w:pPr>
+            <w:r>
+              <w:rPr>
+                <w:rFonts w:ascii="Calibri" w:cs="Calibri" w:eastAsia="Calibri" w:hAnsi="Calibri"/>
+                <w:b w:val="false"/>
+                <w:bCs w:val="false"/>
+                <w:sz w:val="21"/>
+                <w:szCs w:val="21"/>
+              </w:rPr>
+              <w:t>2) Yemeklerin ortalama puanlarının hesaplanması; en beğenilen ve en az beğenilen yemekler sayfası</w:t>
+            </w:r>
+          </w:p>
+          <w:p>
+            <w:pPr>
+              <w:spacing w:after="0"/>
+              <w:jc w:val="left"/>
+            </w:pPr>
+            <w:r>
+              <w:rPr>
+                <w:rFonts w:ascii="Calibri" w:cs="Calibri" w:eastAsia="Calibri" w:hAnsi="Calibri"/>
+                <w:b w:val="false"/>
+                <w:bCs w:val="false"/>
+                <w:sz w:val="21"/>
+                <w:szCs w:val="21"/>
+              </w:rPr>
+              <w:t>3) Yönetici panelinde öğrenci yorumlarını onaylama/silme (moderasyon) ekranı</w:t>
+            </w:r>
+          </w:p>
+          <w:p>
+            <w:pPr>
+              <w:spacing w:after="0"/>
+              <w:jc w:val="left"/>
+            </w:pPr>
+            <w:r>
+              <w:rPr>
+                <w:rFonts w:ascii="Calibri" w:cs="Calibri" w:eastAsia="Calibri" w:hAnsi="Calibri"/>
+                <w:b w:val="false"/>
+                <w:bCs w:val="false"/>
+                <w:sz w:val="21"/>
+                <w:szCs w:val="21"/>
+              </w:rPr>
+              <w:t>4) 1. gösterim geri bildirimlerinin uygulanması</w:t>
             </w:r>
           </w:p>
         </w:tc>
@@ -4250,23 +4218,23 @@
                 <w:sz w:val="21"/>
                 <w:szCs w:val="21"/>
               </w:rPr>
+              <w:t>Efe Can Seymen: 2</w:t>
+            </w:r>
+          </w:p>
+          <w:p>
+            <w:pPr>
+              <w:spacing w:after="0"/>
+              <w:jc w:val="left"/>
+            </w:pPr>
+            <w:r>
+              <w:rPr>
+                <w:rFonts w:ascii="Calibri" w:cs="Calibri" w:eastAsia="Calibri" w:hAnsi="Calibri"/>
+                <w:b w:val="false"/>
+                <w:bCs w:val="false"/>
+                <w:sz w:val="21"/>
+                <w:szCs w:val="21"/>
+              </w:rPr>
               <w:t>Arife Ebrar Üstüner: 3</w:t>
-            </w:r>
-          </w:p>
-          <w:p>
-            <w:pPr>
-              <w:spacing w:after="0"/>
-              <w:jc w:val="left"/>
-            </w:pPr>
-            <w:r>
-              <w:rPr>
-                <w:rFonts w:ascii="Calibri" w:cs="Calibri" w:eastAsia="Calibri" w:hAnsi="Calibri"/>
-                <w:b w:val="false"/>
-                <w:bCs w:val="false"/>
-                <w:sz w:val="21"/>
-                <w:szCs w:val="21"/>
-              </w:rPr>
-              <w:t>Efe Can Seymen: 2</w:t>
             </w:r>
           </w:p>
           <w:p>
@@ -4388,71 +4356,39 @@
                 <w:sz w:val="21"/>
                 <w:szCs w:val="21"/>
               </w:rPr>
-              <w:t>1) Web API: MenulerController tam CRUD (GET/POST/PUT/DELETE)</w:t>
-            </w:r>
-          </w:p>
-          <w:p>
-            <w:pPr>
-              <w:spacing w:after="0"/>
-              <w:jc w:val="left"/>
-            </w:pPr>
-            <w:r>
-              <w:rPr>
-                <w:rFonts w:ascii="Calibri" w:cs="Calibri" w:eastAsia="Calibri" w:hAnsi="Calibri"/>
-                <w:b w:val="false"/>
-                <w:bCs w:val="false"/>
-                <w:sz w:val="21"/>
-                <w:szCs w:val="21"/>
-              </w:rPr>
-              <w:t>2) Yemekler ve Degerlendirmeler API uç noktaları, DTO sınıfları</w:t>
-            </w:r>
-          </w:p>
-          <w:p>
-            <w:pPr>
-              <w:spacing w:after="0"/>
-              <w:jc w:val="left"/>
-            </w:pPr>
-            <w:r>
-              <w:rPr>
-                <w:rFonts w:ascii="Calibri" w:cs="Calibri" w:eastAsia="Calibri" w:hAnsi="Calibri"/>
-                <w:b w:val="false"/>
-                <w:bCs w:val="false"/>
-                <w:sz w:val="21"/>
-                <w:szCs w:val="21"/>
-              </w:rPr>
-              <w:t>3) Swagger entegrasyonu ve API testleri</w:t>
-            </w:r>
-          </w:p>
-          <w:p>
-            <w:pPr>
-              <w:spacing w:after="0"/>
-              <w:jc w:val="left"/>
-            </w:pPr>
-            <w:r>
-              <w:rPr>
-                <w:rFonts w:ascii="Calibri" w:cs="Calibri" w:eastAsia="Calibri" w:hAnsi="Calibri"/>
-                <w:b w:val="false"/>
-                <w:bCs w:val="false"/>
-                <w:sz w:val="21"/>
-                <w:szCs w:val="21"/>
-              </w:rPr>
-              <w:t>4) Mobil istemci için JWT kimlik doğrulaması</w:t>
-            </w:r>
-          </w:p>
-          <w:p>
-            <w:pPr>
-              <w:spacing w:after="0"/>
-              <w:jc w:val="left"/>
-            </w:pPr>
-            <w:r>
-              <w:rPr>
-                <w:rFonts w:ascii="Calibri" w:cs="Calibri" w:eastAsia="Calibri" w:hAnsi="Calibri"/>
-                <w:b w:val="false"/>
-                <w:bCs w:val="false"/>
-                <w:sz w:val="21"/>
-                <w:szCs w:val="21"/>
-              </w:rPr>
-              <w:t>5) Uygulamanın ilk kez sunucuda yayınlanması (mobil uygulamanın erişimi için)</w:t>
+              <w:t>1) Web API: MenulerController için tam CRUD (GET, POST, PUT, DELETE) uç noktalarının yazılması</w:t>
+            </w:r>
+          </w:p>
+          <w:p>
+            <w:pPr>
+              <w:spacing w:after="0"/>
+              <w:jc w:val="left"/>
+            </w:pPr>
+            <w:r>
+              <w:rPr>
+                <w:rFonts w:ascii="Calibri" w:cs="Calibri" w:eastAsia="Calibri" w:hAnsi="Calibri"/>
+                <w:b w:val="false"/>
+                <w:bCs w:val="false"/>
+                <w:sz w:val="21"/>
+                <w:szCs w:val="21"/>
+              </w:rPr>
+              <w:t>2) Yemekler ve Degerlendirmeler için okuma/puanlama API uç noktaları ve DTO sınıfları</w:t>
+            </w:r>
+          </w:p>
+          <w:p>
+            <w:pPr>
+              <w:spacing w:after="0"/>
+              <w:jc w:val="left"/>
+            </w:pPr>
+            <w:r>
+              <w:rPr>
+                <w:rFonts w:ascii="Calibri" w:cs="Calibri" w:eastAsia="Calibri" w:hAnsi="Calibri"/>
+                <w:b w:val="false"/>
+                <w:bCs w:val="false"/>
+                <w:sz w:val="21"/>
+                <w:szCs w:val="21"/>
+              </w:rPr>
+              <w:t>3) Swashbuckle (Swagger UI) entegrasyonu ve tüm API uç noktalarının Swagger üzerinden test edilmesi</w:t>
             </w:r>
           </w:p>
         </w:tc>
@@ -4485,23 +4421,7 @@
                 <w:sz w:val="21"/>
                 <w:szCs w:val="21"/>
               </w:rPr>
-              <w:t>Yılmaz Emre Gündaş: 1, 4</w:t>
-            </w:r>
-          </w:p>
-          <w:p>
-            <w:pPr>
-              <w:spacing w:after="0"/>
-              <w:jc w:val="left"/>
-            </w:pPr>
-            <w:r>
-              <w:rPr>
-                <w:rFonts w:ascii="Calibri" w:cs="Calibri" w:eastAsia="Calibri" w:hAnsi="Calibri"/>
-                <w:b w:val="false"/>
-                <w:bCs w:val="false"/>
-                <w:sz w:val="21"/>
-                <w:szCs w:val="21"/>
-              </w:rPr>
-              <w:t>Arife Ebrar Üstüner: 3, 5</w:t>
+              <w:t>Yılmaz Emre Gündaş: 1</w:t>
             </w:r>
           </w:p>
           <w:p>
@@ -4518,6 +4438,22 @@
                 <w:szCs w:val="21"/>
               </w:rPr>
               <w:t>Efe Can Seymen: 2</w:t>
+            </w:r>
+          </w:p>
+          <w:p>
+            <w:pPr>
+              <w:spacing w:after="0"/>
+              <w:jc w:val="left"/>
+            </w:pPr>
+            <w:r>
+              <w:rPr>
+                <w:rFonts w:ascii="Calibri" w:cs="Calibri" w:eastAsia="Calibri" w:hAnsi="Calibri"/>
+                <w:b w:val="false"/>
+                <w:bCs w:val="false"/>
+                <w:sz w:val="21"/>
+                <w:szCs w:val="21"/>
+              </w:rPr>
+              <w:t>Arife Ebrar Üstüner: 3</w:t>
             </w:r>
           </w:p>
         </w:tc>
@@ -4623,55 +4559,39 @@
                 <w:sz w:val="21"/>
                 <w:szCs w:val="21"/>
               </w:rPr>
-              <w:t>1) Seçenek tabanlı bot servisi: varsayılan Bugün Öğle, Akşam geçişi, Ertesi/Önceki Gün Öğle geçişleri</w:t>
-            </w:r>
-          </w:p>
-          <w:p>
-            <w:pPr>
-              <w:spacing w:after="0"/>
-              <w:jc w:val="left"/>
-            </w:pPr>
-            <w:r>
-              <w:rPr>
-                <w:rFonts w:ascii="Calibri" w:cs="Calibri" w:eastAsia="Calibri" w:hAnsi="Calibri"/>
-                <w:b w:val="false"/>
-                <w:bCs w:val="false"/>
-                <w:sz w:val="21"/>
-                <w:szCs w:val="21"/>
-              </w:rPr>
-              <w:t>2) /api/bot/adim uç noktası ve Yardım butonu (ekip iletişim e-postası gösterimi)</w:t>
-            </w:r>
-          </w:p>
-          <w:p>
-            <w:pPr>
-              <w:spacing w:after="0"/>
-              <w:jc w:val="left"/>
-            </w:pPr>
-            <w:r>
-              <w:rPr>
-                <w:rFonts w:ascii="Calibri" w:cs="Calibri" w:eastAsia="Calibri" w:hAnsi="Calibri"/>
-                <w:b w:val="false"/>
-                <w:bCs w:val="false"/>
-                <w:sz w:val="21"/>
-                <w:szCs w:val="21"/>
-              </w:rPr>
-              <w:t>3) Web sitesinde buton yönlendirmeli etkileşimli sohbet arayüzü (JavaScript fetch)</w:t>
-            </w:r>
-          </w:p>
-          <w:p>
-            <w:pPr>
-              <w:spacing w:after="0"/>
-              <w:jc w:val="left"/>
-            </w:pPr>
-            <w:r>
-              <w:rPr>
-                <w:rFonts w:ascii="Calibri" w:cs="Calibri" w:eastAsia="Calibri" w:hAnsi="Calibri"/>
-                <w:b w:val="false"/>
-                <w:bCs w:val="false"/>
-                <w:sz w:val="21"/>
-                <w:szCs w:val="21"/>
-              </w:rPr>
-              <w:t>4) Sohbet seçenekleri içinden hızlı yemek puanlama akışı</w:t>
+              <w:t>1) Seçenek tabanlı BotServisi: varsayılan Bugün Öğle, Akşam geçişi, Ertesi/Önceki Gün Öğle geçiş mantığı</w:t>
+            </w:r>
+          </w:p>
+          <w:p>
+            <w:pPr>
+              <w:spacing w:after="0"/>
+              <w:jc w:val="left"/>
+            </w:pPr>
+            <w:r>
+              <w:rPr>
+                <w:rFonts w:ascii="Calibri" w:cs="Calibri" w:eastAsia="Calibri" w:hAnsi="Calibri"/>
+                <w:b w:val="false"/>
+                <w:bCs w:val="false"/>
+                <w:sz w:val="21"/>
+                <w:szCs w:val="21"/>
+              </w:rPr>
+              <w:t>2) Web sitesinde seçenek butonlarıyla çalışan etkileşimli sohbet arayüzü (JavaScript fetch + /api/bot/adim)</w:t>
+            </w:r>
+          </w:p>
+          <w:p>
+            <w:pPr>
+              <w:spacing w:after="0"/>
+              <w:jc w:val="left"/>
+            </w:pPr>
+            <w:r>
+              <w:rPr>
+                <w:rFonts w:ascii="Calibri" w:cs="Calibri" w:eastAsia="Calibri" w:hAnsi="Calibri"/>
+                <w:b w:val="false"/>
+                <w:bCs w:val="false"/>
+                <w:sz w:val="21"/>
+                <w:szCs w:val="21"/>
+              </w:rPr>
+              <w:t>3) Sohbet içinden hızlı yemek puanlama seçeneği ve “Yardım” butonu (ekip iletişim e-posta adresinin gösterimi)</w:t>
             </w:r>
           </w:p>
         </w:tc>
@@ -4704,39 +4624,39 @@
                 <w:sz w:val="21"/>
                 <w:szCs w:val="21"/>
               </w:rPr>
-              <w:t>Yılmaz Emre Gündaş: 1</w:t>
-            </w:r>
-          </w:p>
-          <w:p>
-            <w:pPr>
-              <w:spacing w:after="0"/>
-              <w:jc w:val="left"/>
-            </w:pPr>
-            <w:r>
-              <w:rPr>
-                <w:rFonts w:ascii="Calibri" w:cs="Calibri" w:eastAsia="Calibri" w:hAnsi="Calibri"/>
-                <w:b w:val="false"/>
-                <w:bCs w:val="false"/>
-                <w:sz w:val="21"/>
-                <w:szCs w:val="21"/>
-              </w:rPr>
-              <w:t>Arife Ebrar Üstüner: 3</w:t>
-            </w:r>
-          </w:p>
-          <w:p>
-            <w:pPr>
-              <w:spacing w:after="0"/>
-              <w:jc w:val="left"/>
-            </w:pPr>
-            <w:r>
-              <w:rPr>
-                <w:rFonts w:ascii="Calibri" w:cs="Calibri" w:eastAsia="Calibri" w:hAnsi="Calibri"/>
-                <w:b w:val="false"/>
-                <w:bCs w:val="false"/>
-                <w:sz w:val="21"/>
-                <w:szCs w:val="21"/>
-              </w:rPr>
-              <w:t>Efe Can Seymen: 2, 4</w:t>
+              <w:t>Efe Can Seymen: 1</w:t>
+            </w:r>
+          </w:p>
+          <w:p>
+            <w:pPr>
+              <w:spacing w:after="0"/>
+              <w:jc w:val="left"/>
+            </w:pPr>
+            <w:r>
+              <w:rPr>
+                <w:rFonts w:ascii="Calibri" w:cs="Calibri" w:eastAsia="Calibri" w:hAnsi="Calibri"/>
+                <w:b w:val="false"/>
+                <w:bCs w:val="false"/>
+                <w:sz w:val="21"/>
+                <w:szCs w:val="21"/>
+              </w:rPr>
+              <w:t>Arife Ebrar Üstüner: 2</w:t>
+            </w:r>
+          </w:p>
+          <w:p>
+            <w:pPr>
+              <w:spacing w:after="0"/>
+              <w:jc w:val="left"/>
+            </w:pPr>
+            <w:r>
+              <w:rPr>
+                <w:rFonts w:ascii="Calibri" w:cs="Calibri" w:eastAsia="Calibri" w:hAnsi="Calibri"/>
+                <w:b w:val="false"/>
+                <w:bCs w:val="false"/>
+                <w:sz w:val="21"/>
+                <w:szCs w:val="21"/>
+              </w:rPr>
+              <w:t>Yılmaz Emre Gündaş: 3</w:t>
             </w:r>
           </w:p>
         </w:tc>
@@ -4842,55 +4762,39 @@
                 <w:sz w:val="21"/>
                 <w:szCs w:val="21"/>
               </w:rPr>
-              <w:t>1) Telegram Bot API entegrasyonu: Inline Keyboard butonlarıyla aynı seçenek akışının sunulması</w:t>
-            </w:r>
-          </w:p>
-          <w:p>
-            <w:pPr>
-              <w:spacing w:after="0"/>
-              <w:jc w:val="left"/>
-            </w:pPr>
-            <w:r>
-              <w:rPr>
-                <w:rFonts w:ascii="Calibri" w:cs="Calibri" w:eastAsia="Calibri" w:hAnsi="Calibri"/>
-                <w:b w:val="false"/>
-                <w:bCs w:val="false"/>
-                <w:sz w:val="21"/>
-                <w:szCs w:val="21"/>
-              </w:rPr>
-              <w:t>2) Telegram üzerinden puanlama, Yardım/İletişim butonu ve günlük bildirim aboneliği</w:t>
-            </w:r>
-          </w:p>
-          <w:p>
-            <w:pPr>
-              <w:spacing w:after="0"/>
-              <w:jc w:val="left"/>
-            </w:pPr>
-            <w:r>
-              <w:rPr>
-                <w:rFonts w:ascii="Calibri" w:cs="Calibri" w:eastAsia="Calibri" w:hAnsi="Calibri"/>
-                <w:b w:val="false"/>
-                <w:bCs w:val="false"/>
-                <w:sz w:val="21"/>
-                <w:szCs w:val="21"/>
-              </w:rPr>
-              <w:t>3) Yönetici paneli istatistikleri (Chart.js), mobil uyum iyileştirmeleri</w:t>
-            </w:r>
-          </w:p>
-          <w:p>
-            <w:pPr>
-              <w:spacing w:after="0"/>
-              <w:jc w:val="left"/>
-            </w:pPr>
-            <w:r>
-              <w:rPr>
-                <w:rFonts w:ascii="Calibri" w:cs="Calibri" w:eastAsia="Calibri" w:hAnsi="Calibri"/>
-                <w:b w:val="false"/>
-                <w:bCs w:val="false"/>
-                <w:sz w:val="21"/>
-                <w:szCs w:val="21"/>
-              </w:rPr>
-              <w:t>4) Gizli bilgilerin User Secrets’a taşınması, güvenlik kontrolleri</w:t>
+              <w:t>1) Telegram Bot API entegrasyonu: Inline Keyboard butonlarıyla aynı seçenek akışının (Öğle/Akşam/Sonraki-Önceki Gün/Yardım) sunulması</w:t>
+            </w:r>
+          </w:p>
+          <w:p>
+            <w:pPr>
+              <w:spacing w:after="0"/>
+              <w:jc w:val="left"/>
+            </w:pPr>
+            <w:r>
+              <w:rPr>
+                <w:rFonts w:ascii="Calibri" w:cs="Calibri" w:eastAsia="Calibri" w:hAnsi="Calibri"/>
+                <w:b w:val="false"/>
+                <w:bCs w:val="false"/>
+                <w:sz w:val="21"/>
+                <w:szCs w:val="21"/>
+              </w:rPr>
+              <w:t>2) Telegram üzerinden butonlarla yemek puanlama ve günlük menü bildirimi aboneliği</w:t>
+            </w:r>
+          </w:p>
+          <w:p>
+            <w:pPr>
+              <w:spacing w:after="0"/>
+              <w:jc w:val="left"/>
+            </w:pPr>
+            <w:r>
+              <w:rPr>
+                <w:rFonts w:ascii="Calibri" w:cs="Calibri" w:eastAsia="Calibri" w:hAnsi="Calibri"/>
+                <w:b w:val="false"/>
+                <w:bCs w:val="false"/>
+                <w:sz w:val="21"/>
+                <w:szCs w:val="21"/>
+              </w:rPr>
+              <w:t>3) Yönetici panelinde Chart.js ile puan/memnuniyet istatistik grafikleri ve User Secrets güvenlik kontrolleri</w:t>
             </w:r>
           </w:p>
         </w:tc>
@@ -4923,7 +4827,23 @@
                 <w:sz w:val="21"/>
                 <w:szCs w:val="21"/>
               </w:rPr>
-              <w:t>Yılmaz Emre Gündaş: 4</w:t>
+              <w:t>Efe Can Seymen: 1</w:t>
+            </w:r>
+          </w:p>
+          <w:p>
+            <w:pPr>
+              <w:spacing w:after="0"/>
+              <w:jc w:val="left"/>
+            </w:pPr>
+            <w:r>
+              <w:rPr>
+                <w:rFonts w:ascii="Calibri" w:cs="Calibri" w:eastAsia="Calibri" w:hAnsi="Calibri"/>
+                <w:b w:val="false"/>
+                <w:bCs w:val="false"/>
+                <w:sz w:val="21"/>
+                <w:szCs w:val="21"/>
+              </w:rPr>
+              <w:t>Yılmaz Emre Gündaş: 2</w:t>
             </w:r>
           </w:p>
           <w:p>
@@ -4940,22 +4860,6 @@
                 <w:szCs w:val="21"/>
               </w:rPr>
               <w:t>Arife Ebrar Üstüner: 3</w:t>
-            </w:r>
-          </w:p>
-          <w:p>
-            <w:pPr>
-              <w:spacing w:after="0"/>
-              <w:jc w:val="left"/>
-            </w:pPr>
-            <w:r>
-              <w:rPr>
-                <w:rFonts w:ascii="Calibri" w:cs="Calibri" w:eastAsia="Calibri" w:hAnsi="Calibri"/>
-                <w:b w:val="false"/>
-                <w:bCs w:val="false"/>
-                <w:sz w:val="21"/>
-                <w:szCs w:val="21"/>
-              </w:rPr>
-              <w:t>Efe Can Seymen: 1, 2</w:t>
             </w:r>
           </w:p>
         </w:tc>
@@ -5061,55 +4965,39 @@
                 <w:sz w:val="21"/>
                 <w:szCs w:val="21"/>
               </w:rPr>
-              <w:t>1) Uçtan uca test ve hata düzeltmeleri</w:t>
-            </w:r>
-          </w:p>
-          <w:p>
-            <w:pPr>
-              <w:spacing w:after="0"/>
-              <w:jc w:val="left"/>
-            </w:pPr>
-            <w:r>
-              <w:rPr>
-                <w:rFonts w:ascii="Calibri" w:cs="Calibri" w:eastAsia="Calibri" w:hAnsi="Calibri"/>
-                <w:b w:val="false"/>
-                <w:bCs w:val="false"/>
-                <w:sz w:val="21"/>
-                <w:szCs w:val="21"/>
-              </w:rPr>
-              <w:t>2) Son sürümün sunucuda yayınlanması</w:t>
-            </w:r>
-          </w:p>
-          <w:p>
-            <w:pPr>
-              <w:spacing w:after="0"/>
-              <w:jc w:val="left"/>
-            </w:pPr>
-            <w:r>
-              <w:rPr>
-                <w:rFonts w:ascii="Calibri" w:cs="Calibri" w:eastAsia="Calibri" w:hAnsi="Calibri"/>
-                <w:b w:val="false"/>
-                <w:bCs w:val="false"/>
-                <w:sz w:val="21"/>
-                <w:szCs w:val="21"/>
-              </w:rPr>
-              <w:t>3) README.md’nin tamamlanması (kurulum, migration, çalıştırma adımları)</w:t>
-            </w:r>
-          </w:p>
-          <w:p>
-            <w:pPr>
-              <w:spacing w:after="0"/>
-              <w:jc w:val="left"/>
-            </w:pPr>
-            <w:r>
-              <w:rPr>
-                <w:rFonts w:ascii="Calibri" w:cs="Calibri" w:eastAsia="Calibri" w:hAnsi="Calibri"/>
-                <w:b w:val="false"/>
-                <w:bCs w:val="false"/>
-                <w:sz w:val="21"/>
-                <w:szCs w:val="21"/>
-              </w:rPr>
-              <w:t>4) 2. sınıf içi gösterim (23 Aralık) sunumu ve demo verisi</w:t>
+              <w:t>1) Mobil/masaüstü tarayıcı uyumluluk (responsive) kontrolleri ve arayüz iyileştirmeleri</w:t>
+            </w:r>
+          </w:p>
+          <w:p>
+            <w:pPr>
+              <w:spacing w:after="0"/>
+              <w:jc w:val="left"/>
+            </w:pPr>
+            <w:r>
+              <w:rPr>
+                <w:rFonts w:ascii="Calibri" w:cs="Calibri" w:eastAsia="Calibri" w:hAnsi="Calibri"/>
+                <w:b w:val="false"/>
+                <w:bCs w:val="false"/>
+                <w:sz w:val="21"/>
+                <w:szCs w:val="21"/>
+              </w:rPr>
+              <w:t>2) README.md dosyasının son haline getirilmesi (veritabanı kurulumu, migration, çalıştırma adımları)</w:t>
+            </w:r>
+          </w:p>
+          <w:p>
+            <w:pPr>
+              <w:spacing w:after="0"/>
+              <w:jc w:val="left"/>
+            </w:pPr>
+            <w:r>
+              <w:rPr>
+                <w:rFonts w:ascii="Calibri" w:cs="Calibri" w:eastAsia="Calibri" w:hAnsi="Calibri"/>
+                <w:b w:val="false"/>
+                <w:bCs w:val="false"/>
+                <w:sz w:val="21"/>
+                <w:szCs w:val="21"/>
+              </w:rPr>
+              <w:t>3) Uçtan uca testler, hata düzeltmeleri ve 2. sınıf içi gösterim (23 Aralık) sunum hazırlığı</w:t>
             </w:r>
           </w:p>
         </w:tc>
@@ -5142,6 +5030,22 @@
                 <w:sz w:val="21"/>
                 <w:szCs w:val="21"/>
               </w:rPr>
+              <w:t>Arife Ebrar Üstüner: 1</w:t>
+            </w:r>
+          </w:p>
+          <w:p>
+            <w:pPr>
+              <w:spacing w:after="0"/>
+              <w:jc w:val="left"/>
+            </w:pPr>
+            <w:r>
+              <w:rPr>
+                <w:rFonts w:ascii="Calibri" w:cs="Calibri" w:eastAsia="Calibri" w:hAnsi="Calibri"/>
+                <w:b w:val="false"/>
+                <w:bCs w:val="false"/>
+                <w:sz w:val="21"/>
+                <w:szCs w:val="21"/>
+              </w:rPr>
               <w:t>Yılmaz Emre Gündaş: 2</w:t>
             </w:r>
           </w:p>
@@ -5158,22 +5062,6 @@
                 <w:sz w:val="21"/>
                 <w:szCs w:val="21"/>
               </w:rPr>
-              <w:t>Arife Ebrar Üstüner: 4</w:t>
-            </w:r>
-          </w:p>
-          <w:p>
-            <w:pPr>
-              <w:spacing w:after="0"/>
-              <w:jc w:val="left"/>
-            </w:pPr>
-            <w:r>
-              <w:rPr>
-                <w:rFonts w:ascii="Calibri" w:cs="Calibri" w:eastAsia="Calibri" w:hAnsi="Calibri"/>
-                <w:b w:val="false"/>
-                <w:bCs w:val="false"/>
-                <w:sz w:val="21"/>
-                <w:szCs w:val="21"/>
-              </w:rPr>
               <w:t>Efe Can Seymen: 3</w:t>
             </w:r>
           </w:p>
@@ -5190,7 +5078,7 @@
                 <w:sz w:val="21"/>
                 <w:szCs w:val="21"/>
               </w:rPr>
-              <w:t>Tüm üyeler: 1</w:t>
+              <w:t>Tüm üyeler: 3</w:t>
             </w:r>
           </w:p>
         </w:tc>

</xml_diff>